<commit_message>
Übung 2 teil 2
</commit_message>
<xml_diff>
--- a/Dokumentation_m122.docx
+++ b/Dokumentation_m122.docx
@@ -2,16 +2,16 @@
 <file path=word/document.xml><?xml version="1.0" encoding="utf-8"?>
 <w:document xmlns:wpc="http://schemas.microsoft.com/office/word/2010/wordprocessingCanvas" xmlns:cx="http://schemas.microsoft.com/office/drawing/2014/chartex" xmlns:cx1="http://schemas.microsoft.com/office/drawing/2015/9/8/chartex" xmlns:cx2="http://schemas.microsoft.com/office/drawing/2015/10/21/chartex" xmlns:cx3="http://schemas.microsoft.com/office/drawing/2016/5/9/chartex" xmlns:cx4="http://schemas.microsoft.com/office/drawing/2016/5/10/chartex" xmlns:cx5="http://schemas.microsoft.com/office/drawing/2016/5/11/chartex" xmlns:cx6="http://schemas.microsoft.com/office/drawing/2016/5/12/chartex" xmlns:cx7="http://schemas.microsoft.com/office/drawing/2016/5/13/chartex" xmlns:cx8="http://schemas.microsoft.com/office/drawing/2016/5/14/chartex" xmlns:mc="http://schemas.openxmlformats.org/markup-compatibility/2006" xmlns:aink="http://schemas.microsoft.com/office/drawing/2016/ink" xmlns:am3d="http://schemas.microsoft.com/office/drawing/2017/model3d" xmlns:o="urn:schemas-microsoft-com:office:office" xmlns:oel="http://schemas.microsoft.com/office/2019/extlst" xmlns:r="http://schemas.openxmlformats.org/officeDocument/2006/relationships" xmlns:m="http://schemas.openxmlformats.org/officeDocument/2006/math" xmlns:v="urn:schemas-microsoft-com:vml" xmlns:wp14="http://schemas.microsoft.com/office/word/2010/wordprocessingDrawing" xmlns:wp="http://schemas.openxmlformats.org/drawingml/2006/wordprocessingDrawing" xmlns:w10="urn:schemas-microsoft-com:office:word" xmlns:w="http://schemas.openxmlformats.org/wordprocessingml/2006/main" xmlns:w14="http://schemas.microsoft.com/office/word/2010/wordml" xmlns:w15="http://schemas.microsoft.com/office/word/2012/wordml" xmlns:w16cex="http://schemas.microsoft.com/office/word/2018/wordml/cex" xmlns:w16cid="http://schemas.microsoft.com/office/word/2016/wordml/cid" xmlns:w16="http://schemas.microsoft.com/office/word/2018/wordml" xmlns:w16du="http://schemas.microsoft.com/office/word/2023/wordml/word16du" xmlns:w16sdtdh="http://schemas.microsoft.com/office/word/2020/wordml/sdtdatahash" xmlns:w16sdtfl="http://schemas.microsoft.com/office/word/2024/wordml/sdtformatlock" xmlns:w16se="http://schemas.microsoft.com/office/word/2015/wordml/symex" xmlns:wpg="http://schemas.microsoft.com/office/word/2010/wordprocessingGroup" xmlns:wpi="http://schemas.microsoft.com/office/word/2010/wordprocessingInk" xmlns:wne="http://schemas.microsoft.com/office/word/2006/wordml" xmlns:wps="http://schemas.microsoft.com/office/word/2010/wordprocessingShape" mc:Ignorable="w14 w15 w16se w16cid w16 w16cex w16sdtdh w16sdtfl w16du wp14">
   <w:body>
-    <w:sdt>
-      <w:sdtPr>
-        <w:id w:val="1346288509"/>
-        <w:docPartObj>
-          <w:docPartGallery w:val="Cover Pages"/>
-          <w:docPartUnique/>
-        </w:docPartObj>
-      </w:sdtPr>
-      <w:sdtContent>
-        <w:p>
+    <w:p>
+      <w:sdt>
+        <w:sdtPr>
+          <w:id w:val="1346288509"/>
+          <w:docPartObj>
+            <w:docPartGallery w:val="Cover Pages"/>
+            <w:docPartUnique/>
+          </w:docPartObj>
+        </w:sdtPr>
+        <w:sdtContent>
           <w:r>
             <w:rPr>
               <w:noProof/>
@@ -252,9 +252,9 @@
               </mc:Fallback>
             </mc:AlternateContent>
           </w:r>
-        </w:p>
-      </w:sdtContent>
-    </w:sdt>
+        </w:sdtContent>
+      </w:sdt>
+    </w:p>
     <w:p>
       <w:r>
         <w:rPr>
@@ -352,17 +352,30 @@
                                 </w:rPr>
                                 <w:t xml:space="preserve">Quelle : </w:t>
                               </w:r>
-                              <w:hyperlink r:id="rId10" w:history="1">
-                                <w:r>
-                                  <w:rPr>
-                                    <w:rStyle w:val="Hyperlink"/>
-                                    <w:i w:val="0"/>
-                                    <w:iCs w:val="0"/>
-                                    <w:lang w:val="fr-CH"/>
-                                  </w:rPr>
-                                  <w:t>https://de.wikipedia.org/wiki/Linux</w:t>
-                                </w:r>
-                              </w:hyperlink>
+                              <w:r>
+                                <w:fldChar w:fldCharType="begin"/>
+                              </w:r>
+                              <w:r>
+                                <w:rPr>
+                                  <w:lang w:val="fr-CH"/>
+                                </w:rPr>
+                                <w:instrText>HYPERLINK "https://de.wikipedia.org/wiki/Linux"</w:instrText>
+                              </w:r>
+                              <w:r>
+                                <w:fldChar w:fldCharType="separate"/>
+                              </w:r>
+                              <w:r>
+                                <w:rPr>
+                                  <w:rStyle w:val="Hyperlink"/>
+                                  <w:i w:val="0"/>
+                                  <w:iCs w:val="0"/>
+                                  <w:lang w:val="fr-CH"/>
+                                </w:rPr>
+                                <w:t>https://de.wikipedia.org/wiki/Linux</w:t>
+                              </w:r>
+                              <w:r>
+                                <w:fldChar w:fldCharType="end"/>
+                              </w:r>
                               <w:r>
                                 <w:rPr>
                                   <w:i w:val="0"/>
@@ -410,7 +423,7 @@
                   <o:lock v:ext="edit" aspectratio="t"/>
                 </v:shapetype>
                 <v:shape id="Grafik 13" o:spid="_x0000_s1028" type="#_x0000_t75" style="position:absolute;width:29483;height:34963;visibility:visible;mso-wrap-style:square" o:gfxdata="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">
-                  <v:imagedata r:id="rId11" o:title=""/>
+                  <v:imagedata r:id="rId10" o:title=""/>
                 </v:shape>
                 <v:shape id="Textfeld 1" o:spid="_x0000_s1029" type="#_x0000_t202" style="position:absolute;top:35534;width:29483;height:2667;visibility:visible;mso-wrap-style:square;v-text-anchor:top" o:gfxdata="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" filled="f" stroked="f">
                   <v:textbox style="mso-fit-shape-to-text:t" inset="0,0,0,0">
@@ -432,17 +445,30 @@
                           </w:rPr>
                           <w:t xml:space="preserve">Quelle : </w:t>
                         </w:r>
-                        <w:hyperlink r:id="rId12" w:history="1">
-                          <w:r>
-                            <w:rPr>
-                              <w:rStyle w:val="Hyperlink"/>
-                              <w:i w:val="0"/>
-                              <w:iCs w:val="0"/>
-                              <w:lang w:val="fr-CH"/>
-                            </w:rPr>
-                            <w:t>https://de.wikipedia.org/wiki/Linux</w:t>
-                          </w:r>
-                        </w:hyperlink>
+                        <w:r>
+                          <w:fldChar w:fldCharType="begin"/>
+                        </w:r>
+                        <w:r>
+                          <w:rPr>
+                            <w:lang w:val="fr-CH"/>
+                          </w:rPr>
+                          <w:instrText>HYPERLINK "https://de.wikipedia.org/wiki/Linux"</w:instrText>
+                        </w:r>
+                        <w:r>
+                          <w:fldChar w:fldCharType="separate"/>
+                        </w:r>
+                        <w:r>
+                          <w:rPr>
+                            <w:rStyle w:val="Hyperlink"/>
+                            <w:i w:val="0"/>
+                            <w:iCs w:val="0"/>
+                            <w:lang w:val="fr-CH"/>
+                          </w:rPr>
+                          <w:t>https://de.wikipedia.org/wiki/Linux</w:t>
+                        </w:r>
+                        <w:r>
+                          <w:fldChar w:fldCharType="end"/>
+                        </w:r>
                         <w:r>
                           <w:rPr>
                             <w:i w:val="0"/>
@@ -465,7 +491,7 @@
           <w:noProof/>
         </w:rPr>
         <w:drawing>
-          <wp:anchor distT="0" distB="0" distL="114300" distR="114300" simplePos="0" relativeHeight="251671552" behindDoc="1" locked="0" layoutInCell="1" allowOverlap="1" wp14:anchorId="4B06853E" wp14:editId="79AF9F54">
+          <wp:anchor distT="0" distB="0" distL="114300" distR="114300" simplePos="0" relativeHeight="251671552" behindDoc="1" locked="0" layoutInCell="1" allowOverlap="1" wp14:anchorId="4B06853E" wp14:editId="09DCC4EA">
             <wp:simplePos x="0" y="0"/>
             <wp:positionH relativeFrom="column">
               <wp:posOffset>1996734</wp:posOffset>
@@ -488,7 +514,7 @@
                     <pic:cNvPicPr/>
                   </pic:nvPicPr>
                   <pic:blipFill>
-                    <a:blip r:embed="rId13" cstate="print">
+                    <a:blip r:embed="rId11" cstate="print">
                       <a:extLst>
                         <a:ext uri="{28A0092B-C50C-407E-A947-70E740481C1C}">
                           <a14:useLocalDpi xmlns:a14="http://schemas.microsoft.com/office/drawing/2010/main" val="0"/>
@@ -548,7 +574,7 @@
                     <pic:cNvPicPr/>
                   </pic:nvPicPr>
                   <pic:blipFill>
-                    <a:blip r:embed="rId14" cstate="print">
+                    <a:blip r:embed="rId12" cstate="print">
                       <a:extLst>
                         <a:ext uri="{28A0092B-C50C-407E-A947-70E740481C1C}">
                           <a14:useLocalDpi xmlns:a14="http://schemas.microsoft.com/office/drawing/2010/main" val="0"/>
@@ -885,7 +911,7 @@
           <w:r>
             <w:fldChar w:fldCharType="separate"/>
           </w:r>
-          <w:hyperlink w:anchor="_Toc224156840" w:history="1">
+          <w:hyperlink w:anchor="_Toc224757511" w:history="1">
             <w:r>
               <w:rPr>
                 <w:rStyle w:val="Hyperlink"/>
@@ -912,7 +938,7 @@
                 <w:noProof/>
                 <w:webHidden/>
               </w:rPr>
-              <w:instrText xml:space="preserve"> PAGEREF _Toc224156840 \h </w:instrText>
+              <w:instrText xml:space="preserve"> PAGEREF _Toc224757511 \h </w:instrText>
             </w:r>
             <w:r>
               <w:rPr>
@@ -955,7 +981,7 @@
               <w:lang w:eastAsia="de-CH"/>
             </w:rPr>
           </w:pPr>
-          <w:hyperlink w:anchor="_Toc224156841" w:history="1">
+          <w:hyperlink w:anchor="_Toc224757512" w:history="1">
             <w:r>
               <w:rPr>
                 <w:rStyle w:val="Hyperlink"/>
@@ -982,7 +1008,7 @@
                 <w:noProof/>
                 <w:webHidden/>
               </w:rPr>
-              <w:instrText xml:space="preserve"> PAGEREF _Toc224156841 \h </w:instrText>
+              <w:instrText xml:space="preserve"> PAGEREF _Toc224757512 \h </w:instrText>
             </w:r>
             <w:r>
               <w:rPr>
@@ -1025,7 +1051,7 @@
               <w:lang w:eastAsia="de-CH"/>
             </w:rPr>
           </w:pPr>
-          <w:hyperlink w:anchor="_Toc224156842" w:history="1">
+          <w:hyperlink w:anchor="_Toc224757513" w:history="1">
             <w:r>
               <w:rPr>
                 <w:rStyle w:val="Hyperlink"/>
@@ -1056,7 +1082,7 @@
                 <w:noProof/>
                 <w:webHidden/>
               </w:rPr>
-              <w:instrText xml:space="preserve"> PAGEREF _Toc224156842 \h </w:instrText>
+              <w:instrText xml:space="preserve"> PAGEREF _Toc224757513 \h </w:instrText>
             </w:r>
             <w:r>
               <w:rPr>
@@ -1099,7 +1125,7 @@
               <w:lang w:eastAsia="de-CH"/>
             </w:rPr>
           </w:pPr>
-          <w:hyperlink w:anchor="_Toc224156843" w:history="1">
+          <w:hyperlink w:anchor="_Toc224757514" w:history="1">
             <w:r>
               <w:rPr>
                 <w:rStyle w:val="Hyperlink"/>
@@ -1126,7 +1152,7 @@
                 <w:noProof/>
                 <w:webHidden/>
               </w:rPr>
-              <w:instrText xml:space="preserve"> PAGEREF _Toc224156843 \h </w:instrText>
+              <w:instrText xml:space="preserve"> PAGEREF _Toc224757514 \h </w:instrText>
             </w:r>
             <w:r>
               <w:rPr>
@@ -1169,7 +1195,7 @@
               <w:lang w:eastAsia="de-CH"/>
             </w:rPr>
           </w:pPr>
-          <w:hyperlink w:anchor="_Toc224156844" w:history="1">
+          <w:hyperlink w:anchor="_Toc224757515" w:history="1">
             <w:r>
               <w:rPr>
                 <w:rStyle w:val="Hyperlink"/>
@@ -1196,7 +1222,7 @@
                 <w:noProof/>
                 <w:webHidden/>
               </w:rPr>
-              <w:instrText xml:space="preserve"> PAGEREF _Toc224156844 \h </w:instrText>
+              <w:instrText xml:space="preserve"> PAGEREF _Toc224757515 \h </w:instrText>
             </w:r>
             <w:r>
               <w:rPr>
@@ -1239,7 +1265,7 @@
               <w:lang w:eastAsia="de-CH"/>
             </w:rPr>
           </w:pPr>
-          <w:hyperlink w:anchor="_Toc224156845" w:history="1">
+          <w:hyperlink w:anchor="_Toc224757516" w:history="1">
             <w:r>
               <w:rPr>
                 <w:rStyle w:val="Hyperlink"/>
@@ -1266,7 +1292,7 @@
                 <w:noProof/>
                 <w:webHidden/>
               </w:rPr>
-              <w:instrText xml:space="preserve"> PAGEREF _Toc224156845 \h </w:instrText>
+              <w:instrText xml:space="preserve"> PAGEREF _Toc224757516 \h </w:instrText>
             </w:r>
             <w:r>
               <w:rPr>
@@ -1309,7 +1335,7 @@
               <w:lang w:eastAsia="de-CH"/>
             </w:rPr>
           </w:pPr>
-          <w:hyperlink w:anchor="_Toc224156846" w:history="1">
+          <w:hyperlink w:anchor="_Toc224757517" w:history="1">
             <w:r>
               <w:rPr>
                 <w:rStyle w:val="Hyperlink"/>
@@ -1336,7 +1362,7 @@
                 <w:noProof/>
                 <w:webHidden/>
               </w:rPr>
-              <w:instrText xml:space="preserve"> PAGEREF _Toc224156846 \h </w:instrText>
+              <w:instrText xml:space="preserve"> PAGEREF _Toc224757517 \h </w:instrText>
             </w:r>
             <w:r>
               <w:rPr>
@@ -1379,7 +1405,7 @@
               <w:lang w:eastAsia="de-CH"/>
             </w:rPr>
           </w:pPr>
-          <w:hyperlink w:anchor="_Toc224156847" w:history="1">
+          <w:hyperlink w:anchor="_Toc224757518" w:history="1">
             <w:r>
               <w:rPr>
                 <w:rStyle w:val="Hyperlink"/>
@@ -1406,7 +1432,7 @@
                 <w:noProof/>
                 <w:webHidden/>
               </w:rPr>
-              <w:instrText xml:space="preserve"> PAGEREF _Toc224156847 \h </w:instrText>
+              <w:instrText xml:space="preserve"> PAGEREF _Toc224757518 \h </w:instrText>
             </w:r>
             <w:r>
               <w:rPr>
@@ -1449,7 +1475,7 @@
               <w:lang w:eastAsia="de-CH"/>
             </w:rPr>
           </w:pPr>
-          <w:hyperlink w:anchor="_Toc224156848" w:history="1">
+          <w:hyperlink w:anchor="_Toc224757519" w:history="1">
             <w:r>
               <w:rPr>
                 <w:rStyle w:val="Hyperlink"/>
@@ -1476,7 +1502,7 @@
                 <w:noProof/>
                 <w:webHidden/>
               </w:rPr>
-              <w:instrText xml:space="preserve"> PAGEREF _Toc224156848 \h </w:instrText>
+              <w:instrText xml:space="preserve"> PAGEREF _Toc224757519 \h </w:instrText>
             </w:r>
             <w:r>
               <w:rPr>
@@ -1519,7 +1545,7 @@
               <w:lang w:eastAsia="de-CH"/>
             </w:rPr>
           </w:pPr>
-          <w:hyperlink w:anchor="_Toc224156849" w:history="1">
+          <w:hyperlink w:anchor="_Toc224757520" w:history="1">
             <w:r>
               <w:rPr>
                 <w:rStyle w:val="Hyperlink"/>
@@ -1546,7 +1572,7 @@
                 <w:noProof/>
                 <w:webHidden/>
               </w:rPr>
-              <w:instrText xml:space="preserve"> PAGEREF _Toc224156849 \h </w:instrText>
+              <w:instrText xml:space="preserve"> PAGEREF _Toc224757520 \h </w:instrText>
             </w:r>
             <w:r>
               <w:rPr>
@@ -1589,7 +1615,7 @@
               <w:lang w:eastAsia="de-CH"/>
             </w:rPr>
           </w:pPr>
-          <w:hyperlink w:anchor="_Toc224156850" w:history="1">
+          <w:hyperlink w:anchor="_Toc224757521" w:history="1">
             <w:r>
               <w:rPr>
                 <w:rStyle w:val="Hyperlink"/>
@@ -1616,7 +1642,7 @@
                 <w:noProof/>
                 <w:webHidden/>
               </w:rPr>
-              <w:instrText xml:space="preserve"> PAGEREF _Toc224156850 \h </w:instrText>
+              <w:instrText xml:space="preserve"> PAGEREF _Toc224757521 \h </w:instrText>
             </w:r>
             <w:r>
               <w:rPr>
@@ -1659,7 +1685,7 @@
               <w:lang w:eastAsia="de-CH"/>
             </w:rPr>
           </w:pPr>
-          <w:hyperlink w:anchor="_Toc224156851" w:history="1">
+          <w:hyperlink w:anchor="_Toc224757522" w:history="1">
             <w:r>
               <w:rPr>
                 <w:rStyle w:val="Hyperlink"/>
@@ -1686,7 +1712,7 @@
                 <w:noProof/>
                 <w:webHidden/>
               </w:rPr>
-              <w:instrText xml:space="preserve"> PAGEREF _Toc224156851 \h </w:instrText>
+              <w:instrText xml:space="preserve"> PAGEREF _Toc224757522 \h </w:instrText>
             </w:r>
             <w:r>
               <w:rPr>
@@ -1729,7 +1755,7 @@
               <w:lang w:eastAsia="de-CH"/>
             </w:rPr>
           </w:pPr>
-          <w:hyperlink w:anchor="_Toc224156852" w:history="1">
+          <w:hyperlink w:anchor="_Toc224757523" w:history="1">
             <w:r>
               <w:rPr>
                 <w:rStyle w:val="Hyperlink"/>
@@ -1756,7 +1782,7 @@
                 <w:noProof/>
                 <w:webHidden/>
               </w:rPr>
-              <w:instrText xml:space="preserve"> PAGEREF _Toc224156852 \h </w:instrText>
+              <w:instrText xml:space="preserve"> PAGEREF _Toc224757523 \h </w:instrText>
             </w:r>
             <w:r>
               <w:rPr>
@@ -1777,6 +1803,146 @@
                 <w:webHidden/>
               </w:rPr>
               <w:t>5</w:t>
+            </w:r>
+            <w:r>
+              <w:rPr>
+                <w:noProof/>
+                <w:webHidden/>
+              </w:rPr>
+              <w:fldChar w:fldCharType="end"/>
+            </w:r>
+          </w:hyperlink>
+        </w:p>
+        <w:p>
+          <w:pPr>
+            <w:pStyle w:val="Verzeichnis2"/>
+            <w:tabs>
+              <w:tab w:val="right" w:leader="dot" w:pos="9062"/>
+            </w:tabs>
+            <w:rPr>
+              <w:rFonts w:eastAsiaTheme="minorEastAsia"/>
+              <w:noProof/>
+              <w:lang w:eastAsia="de-CH"/>
+            </w:rPr>
+          </w:pPr>
+          <w:hyperlink w:anchor="_Toc224757524" w:history="1">
+            <w:r>
+              <w:rPr>
+                <w:rStyle w:val="Hyperlink"/>
+                <w:noProof/>
+              </w:rPr>
+              <w:t>Teil 2</w:t>
+            </w:r>
+            <w:r>
+              <w:rPr>
+                <w:noProof/>
+                <w:webHidden/>
+              </w:rPr>
+              <w:tab/>
+            </w:r>
+            <w:r>
+              <w:rPr>
+                <w:noProof/>
+                <w:webHidden/>
+              </w:rPr>
+              <w:fldChar w:fldCharType="begin"/>
+            </w:r>
+            <w:r>
+              <w:rPr>
+                <w:noProof/>
+                <w:webHidden/>
+              </w:rPr>
+              <w:instrText xml:space="preserve"> PAGEREF _Toc224757524 \h </w:instrText>
+            </w:r>
+            <w:r>
+              <w:rPr>
+                <w:noProof/>
+                <w:webHidden/>
+              </w:rPr>
+            </w:r>
+            <w:r>
+              <w:rPr>
+                <w:noProof/>
+                <w:webHidden/>
+              </w:rPr>
+              <w:fldChar w:fldCharType="separate"/>
+            </w:r>
+            <w:r>
+              <w:rPr>
+                <w:noProof/>
+                <w:webHidden/>
+              </w:rPr>
+              <w:t>8</w:t>
+            </w:r>
+            <w:r>
+              <w:rPr>
+                <w:noProof/>
+                <w:webHidden/>
+              </w:rPr>
+              <w:fldChar w:fldCharType="end"/>
+            </w:r>
+          </w:hyperlink>
+        </w:p>
+        <w:p>
+          <w:pPr>
+            <w:pStyle w:val="Verzeichnis3"/>
+            <w:tabs>
+              <w:tab w:val="right" w:leader="dot" w:pos="9062"/>
+            </w:tabs>
+            <w:rPr>
+              <w:rFonts w:eastAsiaTheme="minorEastAsia"/>
+              <w:noProof/>
+              <w:lang w:eastAsia="de-CH"/>
+            </w:rPr>
+          </w:pPr>
+          <w:hyperlink w:anchor="_Toc224757525" w:history="1">
+            <w:r>
+              <w:rPr>
+                <w:rStyle w:val="Hyperlink"/>
+                <w:noProof/>
+              </w:rPr>
+              <w:t>Kontrollstrukturen</w:t>
+            </w:r>
+            <w:r>
+              <w:rPr>
+                <w:noProof/>
+                <w:webHidden/>
+              </w:rPr>
+              <w:tab/>
+            </w:r>
+            <w:r>
+              <w:rPr>
+                <w:noProof/>
+                <w:webHidden/>
+              </w:rPr>
+              <w:fldChar w:fldCharType="begin"/>
+            </w:r>
+            <w:r>
+              <w:rPr>
+                <w:noProof/>
+                <w:webHidden/>
+              </w:rPr>
+              <w:instrText xml:space="preserve"> PAGEREF _Toc224757525 \h </w:instrText>
+            </w:r>
+            <w:r>
+              <w:rPr>
+                <w:noProof/>
+                <w:webHidden/>
+              </w:rPr>
+            </w:r>
+            <w:r>
+              <w:rPr>
+                <w:noProof/>
+                <w:webHidden/>
+              </w:rPr>
+              <w:fldChar w:fldCharType="separate"/>
+            </w:r>
+            <w:r>
+              <w:rPr>
+                <w:noProof/>
+                <w:webHidden/>
+              </w:rPr>
+              <w:t>8</w:t>
             </w:r>
             <w:r>
               <w:rPr>
@@ -2003,7 +2169,7 @@
       <w:pPr>
         <w:pStyle w:val="berschrift2"/>
       </w:pPr>
-      <w:bookmarkStart w:id="0" w:name="_Toc224156840"/>
+      <w:bookmarkStart w:id="0" w:name="_Toc224757511"/>
       <w:r>
         <w:lastRenderedPageBreak/>
         <w:t>Verbindung zu SSH</w:t>
@@ -2083,7 +2249,7 @@
                           </pic:cNvPicPr>
                         </pic:nvPicPr>
                         <pic:blipFill>
-                          <a:blip r:embed="rId15" cstate="print">
+                          <a:blip r:embed="rId13" cstate="print">
                             <a:extLst>
                               <a:ext uri="{28A0092B-C50C-407E-A947-70E740481C1C}">
                                 <a14:useLocalDpi xmlns:a14="http://schemas.microsoft.com/office/drawing/2010/main" val="0"/>
@@ -2199,7 +2365,7 @@
       <w:pPr>
         <w:pStyle w:val="berschrift1"/>
       </w:pPr>
-      <w:bookmarkStart w:id="1" w:name="_Toc224156841"/>
+      <w:bookmarkStart w:id="1" w:name="_Toc224757512"/>
       <w:r>
         <w:t>Übung 1</w:t>
       </w:r>
@@ -2218,7 +2384,7 @@
           <w14:ligatures w14:val="none"/>
         </w:rPr>
       </w:pPr>
-      <w:bookmarkStart w:id="2" w:name="_Toc224156842"/>
+      <w:bookmarkStart w:id="2" w:name="_Toc224757513"/>
       <w:r>
         <w:rPr>
           <w:rFonts w:eastAsia="Times New Roman" w:cs="Times New Roman"/>
@@ -2415,7 +2581,7 @@
       <w:pPr>
         <w:pStyle w:val="berschrift3"/>
       </w:pPr>
-      <w:bookmarkStart w:id="3" w:name="_Toc224156843"/>
+      <w:bookmarkStart w:id="3" w:name="_Toc224757514"/>
       <w:r>
         <w:lastRenderedPageBreak/>
         <w:t>In den Login Ordner wechseln</w:t>
@@ -2641,7 +2807,7 @@
       <w:pPr>
         <w:pStyle w:val="berschrift3"/>
       </w:pPr>
-      <w:bookmarkStart w:id="4" w:name="_Toc224156844"/>
+      <w:bookmarkStart w:id="4" w:name="_Toc224757515"/>
       <w:r>
         <w:t>Ordner für die Systemkonfiguration</w:t>
       </w:r>
@@ -2720,7 +2886,7 @@
       <w:pPr>
         <w:pStyle w:val="berschrift1"/>
       </w:pPr>
-      <w:bookmarkStart w:id="5" w:name="_Toc224156845"/>
+      <w:bookmarkStart w:id="5" w:name="_Toc224757516"/>
       <w:r>
         <w:t>Skript im Shell</w:t>
       </w:r>
@@ -2733,7 +2899,7 @@
       <w:pPr>
         <w:pStyle w:val="berschrift2"/>
       </w:pPr>
-      <w:bookmarkStart w:id="6" w:name="_Toc224156846"/>
+      <w:bookmarkStart w:id="6" w:name="_Toc224757517"/>
       <w:r>
         <w:t>Nano</w:t>
       </w:r>
@@ -2782,7 +2948,7 @@
       <w:pPr>
         <w:pStyle w:val="berschrift1"/>
       </w:pPr>
-      <w:bookmarkStart w:id="7" w:name="_Toc224156847"/>
+      <w:bookmarkStart w:id="7" w:name="_Toc224757518"/>
       <w:r>
         <w:t>Übung 2</w:t>
       </w:r>
@@ -2795,7 +2961,7 @@
       <w:pPr>
         <w:pStyle w:val="berschrift3"/>
       </w:pPr>
-      <w:bookmarkStart w:id="8" w:name="_Toc224156848"/>
+      <w:bookmarkStart w:id="8" w:name="_Toc224757519"/>
       <w:r>
         <w:t>Mein erstes Skript</w:t>
       </w:r>
@@ -3164,7 +3330,7 @@
       <w:pPr>
         <w:pStyle w:val="berschrift3"/>
       </w:pPr>
-      <w:bookmarkStart w:id="9" w:name="_Toc224156849"/>
+      <w:bookmarkStart w:id="9" w:name="_Toc224757520"/>
       <w:r>
         <w:t>Variablen</w:t>
       </w:r>
@@ -3187,7 +3353,7 @@
       <w:pPr>
         <w:pStyle w:val="berschrift3"/>
       </w:pPr>
-      <w:bookmarkStart w:id="10" w:name="_Toc224156850"/>
+      <w:bookmarkStart w:id="10" w:name="_Toc224757521"/>
       <w:r>
         <w:t>Automatische Bash-Variablen</w:t>
       </w:r>
@@ -3540,7 +3706,7 @@
       <w:pPr>
         <w:pStyle w:val="berschrift3"/>
       </w:pPr>
-      <w:bookmarkStart w:id="11" w:name="_Toc224156851"/>
+      <w:bookmarkStart w:id="11" w:name="_Toc224757522"/>
       <w:r>
         <w:t>Arithmetische Berechnungen</w:t>
       </w:r>
@@ -3962,7 +4128,7 @@
       <w:pPr>
         <w:pStyle w:val="berschrift3"/>
       </w:pPr>
-      <w:bookmarkStart w:id="12" w:name="_Toc224156852"/>
+      <w:bookmarkStart w:id="12" w:name="_Toc224757523"/>
       <w:r>
         <w:t>Zeichenkettenverarbeitung</w:t>
       </w:r>
@@ -3977,6 +4143,9 @@
         </w:numPr>
       </w:pPr>
       <w:r>
+        <w:rPr>
+          <w:noProof/>
+        </w:rPr>
         <w:drawing>
           <wp:anchor distT="0" distB="0" distL="114300" distR="114300" simplePos="0" relativeHeight="251681792" behindDoc="0" locked="0" layoutInCell="1" allowOverlap="1" wp14:anchorId="6CC92A8F" wp14:editId="7590FE92">
             <wp:simplePos x="0" y="0"/>
@@ -4052,6 +4221,9 @@
         <w:ind w:left="360"/>
       </w:pPr>
       <w:r>
+        <w:rPr>
+          <w:noProof/>
+        </w:rPr>
         <w:lastRenderedPageBreak/>
         <w:drawing>
           <wp:anchor distT="0" distB="0" distL="114300" distR="114300" simplePos="0" relativeHeight="251682816" behindDoc="0" locked="0" layoutInCell="1" allowOverlap="1" wp14:anchorId="3F7E625A" wp14:editId="77068B76">
@@ -4117,6 +4289,9 @@
         <w:ind w:left="360"/>
       </w:pPr>
       <w:r>
+        <w:rPr>
+          <w:noProof/>
+        </w:rPr>
         <w:drawing>
           <wp:anchor distT="0" distB="0" distL="114300" distR="114300" simplePos="0" relativeHeight="251683840" behindDoc="0" locked="0" layoutInCell="1" allowOverlap="1" wp14:anchorId="57BF3949" wp14:editId="28024ED0">
             <wp:simplePos x="0" y="0"/>
@@ -4181,6 +4356,9 @@
         <w:ind w:left="360"/>
       </w:pPr>
       <w:r>
+        <w:rPr>
+          <w:noProof/>
+        </w:rPr>
         <w:drawing>
           <wp:anchor distT="0" distB="0" distL="114300" distR="114300" simplePos="0" relativeHeight="251684864" behindDoc="0" locked="0" layoutInCell="1" allowOverlap="1" wp14:anchorId="4C4785F7" wp14:editId="017B5C52">
             <wp:simplePos x="0" y="0"/>
@@ -4266,6 +4444,9 @@
         <w:ind w:left="360"/>
       </w:pPr>
       <w:r>
+        <w:rPr>
+          <w:noProof/>
+        </w:rPr>
         <w:drawing>
           <wp:inline distT="0" distB="0" distL="0" distR="0" wp14:anchorId="69316E7D" wp14:editId="2868A5ED">
             <wp:extent cx="2076465" cy="342903"/>
@@ -4319,8 +4500,13 @@
         </w:numPr>
       </w:pPr>
       <w:r>
-        <w:t>-d ':' → Trennzeichen ist :</w:t>
-      </w:r>
+        <w:t xml:space="preserve">-d ':' → Trennzeichen </w:t>
+      </w:r>
+      <w:proofErr w:type="gramStart"/>
+      <w:r>
+        <w:t>ist :</w:t>
+      </w:r>
+      <w:proofErr w:type="gramEnd"/>
     </w:p>
     <w:p>
       <w:pPr>
@@ -4346,6 +4532,9 @@
         <w:ind w:left="360"/>
       </w:pPr>
       <w:r>
+        <w:rPr>
+          <w:noProof/>
+        </w:rPr>
         <w:drawing>
           <wp:inline distT="0" distB="0" distL="0" distR="0" wp14:anchorId="5381DB51" wp14:editId="37C78DFD">
             <wp:extent cx="1009791" cy="1257475"/>
@@ -4417,6 +4606,9 @@
         <w:ind w:left="360"/>
       </w:pPr>
       <w:r>
+        <w:rPr>
+          <w:noProof/>
+        </w:rPr>
         <w:drawing>
           <wp:inline distT="0" distB="0" distL="0" distR="0" wp14:anchorId="459B3A06" wp14:editId="641A014A">
             <wp:extent cx="5760720" cy="593090"/>
@@ -4467,6 +4659,9 @@
         <w:ind w:left="360"/>
       </w:pPr>
       <w:r>
+        <w:rPr>
+          <w:noProof/>
+        </w:rPr>
         <w:lastRenderedPageBreak/>
         <w:drawing>
           <wp:inline distT="0" distB="0" distL="0" distR="0" wp14:anchorId="61020D09" wp14:editId="26BAEF42">
@@ -4582,6 +4777,9 @@
         <w:ind w:left="360"/>
       </w:pPr>
       <w:r>
+        <w:rPr>
+          <w:noProof/>
+        </w:rPr>
         <w:drawing>
           <wp:inline distT="0" distB="0" distL="0" distR="0" wp14:anchorId="6825BD2E" wp14:editId="0AD776D7">
             <wp:extent cx="4867954" cy="562053"/>
@@ -4632,6 +4830,9 @@
         <w:ind w:left="360"/>
       </w:pPr>
       <w:r>
+        <w:rPr>
+          <w:noProof/>
+        </w:rPr>
         <w:drawing>
           <wp:inline distT="0" distB="0" distL="0" distR="0" wp14:anchorId="417E8111" wp14:editId="2D2A4F3B">
             <wp:extent cx="514422" cy="571580"/>
@@ -4727,6 +4928,9 @@
         <w:ind w:left="360"/>
       </w:pPr>
       <w:r>
+        <w:rPr>
+          <w:noProof/>
+        </w:rPr>
         <w:drawing>
           <wp:inline distT="0" distB="0" distL="0" distR="0" wp14:anchorId="507690C1" wp14:editId="6F9C125A">
             <wp:extent cx="4067743" cy="514422"/>
@@ -4777,6 +4981,9 @@
         <w:ind w:left="360"/>
       </w:pPr>
       <w:r>
+        <w:rPr>
+          <w:noProof/>
+        </w:rPr>
         <w:drawing>
           <wp:inline distT="0" distB="0" distL="0" distR="0" wp14:anchorId="21AA8CC0" wp14:editId="26E65FDE">
             <wp:extent cx="1657581" cy="676369"/>
@@ -4837,6 +5044,9 @@
         <w:ind w:left="360"/>
       </w:pPr>
       <w:r>
+        <w:rPr>
+          <w:noProof/>
+        </w:rPr>
         <w:drawing>
           <wp:inline distT="0" distB="0" distL="0" distR="0" wp14:anchorId="19C2CCCA" wp14:editId="613727AA">
             <wp:extent cx="3753374" cy="714475"/>
@@ -4915,6 +5125,9 @@
         <w:ind w:left="360"/>
       </w:pPr>
       <w:r>
+        <w:rPr>
+          <w:noProof/>
+        </w:rPr>
         <w:drawing>
           <wp:inline distT="0" distB="0" distL="0" distR="0" wp14:anchorId="42894B2C" wp14:editId="2834976A">
             <wp:extent cx="5760720" cy="440055"/>
@@ -5273,10 +5486,1033 @@
         <w:ind w:left="360"/>
       </w:pPr>
     </w:p>
+    <w:p>
+      <w:pPr>
+        <w:pStyle w:val="berschrift2"/>
+      </w:pPr>
+      <w:bookmarkStart w:id="13" w:name="_Toc224757524"/>
+      <w:r>
+        <w:t>Teil 2</w:t>
+      </w:r>
+      <w:bookmarkEnd w:id="13"/>
+      <w:r>
+        <w:t xml:space="preserve"> </w:t>
+      </w:r>
+    </w:p>
+    <w:p>
+      <w:pPr>
+        <w:pStyle w:val="berschrift3"/>
+      </w:pPr>
+      <w:bookmarkStart w:id="14" w:name="_Toc224757525"/>
+      <w:r>
+        <w:t>Kontrollstrukturen</w:t>
+      </w:r>
+      <w:bookmarkEnd w:id="14"/>
+    </w:p>
+    <w:p>
+      <w:r>
+        <w:t>Kontrollstrukturen steuern den Ablauf eines Bash-Skripts.</w:t>
+      </w:r>
+    </w:p>
+    <w:p>
+      <w:pPr>
+        <w:rPr>
+          <w:b/>
+          <w:bCs/>
+        </w:rPr>
+      </w:pPr>
+      <w:proofErr w:type="spellStart"/>
+      <w:r>
+        <w:rPr>
+          <w:b/>
+          <w:bCs/>
+        </w:rPr>
+        <w:t>if</w:t>
+      </w:r>
+      <w:proofErr w:type="spellEnd"/>
+      <w:r>
+        <w:rPr>
+          <w:b/>
+          <w:bCs/>
+        </w:rPr>
+        <w:t xml:space="preserve"> / </w:t>
+      </w:r>
+      <w:proofErr w:type="spellStart"/>
+      <w:r>
+        <w:rPr>
+          <w:b/>
+          <w:bCs/>
+        </w:rPr>
+        <w:t>then</w:t>
+      </w:r>
+      <w:proofErr w:type="spellEnd"/>
+      <w:r>
+        <w:rPr>
+          <w:b/>
+          <w:bCs/>
+        </w:rPr>
+        <w:t xml:space="preserve"> / </w:t>
+      </w:r>
+      <w:proofErr w:type="spellStart"/>
+      <w:r>
+        <w:rPr>
+          <w:b/>
+          <w:bCs/>
+        </w:rPr>
+        <w:t>else</w:t>
+      </w:r>
+      <w:proofErr w:type="spellEnd"/>
+      <w:r>
+        <w:rPr>
+          <w:b/>
+          <w:bCs/>
+        </w:rPr>
+        <w:t xml:space="preserve"> / </w:t>
+      </w:r>
+      <w:proofErr w:type="spellStart"/>
+      <w:r>
+        <w:rPr>
+          <w:b/>
+          <w:bCs/>
+        </w:rPr>
+        <w:t>elif</w:t>
+      </w:r>
+      <w:proofErr w:type="spellEnd"/>
+    </w:p>
+    <w:p>
+      <w:r>
+        <w:t xml:space="preserve">Mit </w:t>
+      </w:r>
+      <w:proofErr w:type="spellStart"/>
+      <w:r>
+        <w:t>if</w:t>
+      </w:r>
+      <w:proofErr w:type="spellEnd"/>
+      <w:r>
+        <w:t xml:space="preserve"> werden Bedingungen überprüft:</w:t>
+      </w:r>
+    </w:p>
+    <w:p>
+      <w:r>
+        <w:drawing>
+          <wp:inline distT="0" distB="0" distL="0" distR="0" wp14:anchorId="45E9A693" wp14:editId="2FA81F35">
+            <wp:extent cx="2057415" cy="1419235"/>
+            <wp:effectExtent l="0" t="0" r="0" b="9525"/>
+            <wp:docPr id="1523994548" name="Grafik 1"/>
+            <wp:cNvGraphicFramePr>
+              <a:graphicFrameLocks xmlns:a="http://schemas.openxmlformats.org/drawingml/2006/main" noChangeAspect="1"/>
+            </wp:cNvGraphicFramePr>
+            <a:graphic xmlns:a="http://schemas.openxmlformats.org/drawingml/2006/main">
+              <a:graphicData uri="http://schemas.openxmlformats.org/drawingml/2006/picture">
+                <pic:pic xmlns:pic="http://schemas.openxmlformats.org/drawingml/2006/picture">
+                  <pic:nvPicPr>
+                    <pic:cNvPr id="1523994548" name=""/>
+                    <pic:cNvPicPr/>
+                  </pic:nvPicPr>
+                  <pic:blipFill>
+                    <a:blip r:embed="rId43"/>
+                    <a:stretch>
+                      <a:fillRect/>
+                    </a:stretch>
+                  </pic:blipFill>
+                  <pic:spPr>
+                    <a:xfrm>
+                      <a:off x="0" y="0"/>
+                      <a:ext cx="2057415" cy="1419235"/>
+                    </a:xfrm>
+                    <a:prstGeom prst="rect">
+                      <a:avLst/>
+                    </a:prstGeom>
+                  </pic:spPr>
+                </pic:pic>
+              </a:graphicData>
+            </a:graphic>
+          </wp:inline>
+        </w:drawing>
+      </w:r>
+    </w:p>
+    <w:p>
+      <w:r>
+        <w:t>Verwendung:</w:t>
+      </w:r>
+    </w:p>
+    <w:p>
+      <w:pPr>
+        <w:numPr>
+          <w:ilvl w:val="0"/>
+          <w:numId w:val="6"/>
+        </w:numPr>
+      </w:pPr>
+      <w:r>
+        <w:t>Entscheidungen treffen</w:t>
+      </w:r>
+    </w:p>
+    <w:p>
+      <w:pPr>
+        <w:numPr>
+          <w:ilvl w:val="0"/>
+          <w:numId w:val="6"/>
+        </w:numPr>
+      </w:pPr>
+      <w:r>
+        <w:lastRenderedPageBreak/>
+        <w:t>Bedingungen prüfen (z. B. Dateien vorhanden, Zahlen vergleichen)</w:t>
+      </w:r>
+    </w:p>
+    <w:p/>
+    <w:p>
+      <w:pPr>
+        <w:rPr>
+          <w:b/>
+          <w:bCs/>
+        </w:rPr>
+      </w:pPr>
+      <w:r>
+        <w:rPr>
+          <w:b/>
+          <w:bCs/>
+        </w:rPr>
+        <w:t>S</w:t>
+      </w:r>
+      <w:r>
+        <w:rPr>
+          <w:b/>
+          <w:bCs/>
+        </w:rPr>
+        <w:t>chleifen</w:t>
+      </w:r>
+    </w:p>
+    <w:p>
+      <w:pPr>
+        <w:rPr>
+          <w:b/>
+          <w:bCs/>
+        </w:rPr>
+      </w:pPr>
+      <w:proofErr w:type="spellStart"/>
+      <w:r>
+        <w:rPr>
+          <w:b/>
+          <w:bCs/>
+        </w:rPr>
+        <w:t>for</w:t>
+      </w:r>
+      <w:proofErr w:type="spellEnd"/>
+      <w:r>
+        <w:rPr>
+          <w:b/>
+          <w:bCs/>
+        </w:rPr>
+        <w:t>-Schleife</w:t>
+      </w:r>
+    </w:p>
+    <w:p>
+      <w:r>
+        <w:t>Wird verwendet, wenn die Anzahl Durchläufe bekannt ist:</w:t>
+      </w:r>
+    </w:p>
+    <w:p>
+      <w:r>
+        <w:drawing>
+          <wp:inline distT="0" distB="0" distL="0" distR="0" wp14:anchorId="2016A356" wp14:editId="1F84E7DF">
+            <wp:extent cx="2324424" cy="1667108"/>
+            <wp:effectExtent l="0" t="0" r="0" b="9525"/>
+            <wp:docPr id="23427552" name="Grafik 1"/>
+            <wp:cNvGraphicFramePr>
+              <a:graphicFrameLocks xmlns:a="http://schemas.openxmlformats.org/drawingml/2006/main" noChangeAspect="1"/>
+            </wp:cNvGraphicFramePr>
+            <a:graphic xmlns:a="http://schemas.openxmlformats.org/drawingml/2006/main">
+              <a:graphicData uri="http://schemas.openxmlformats.org/drawingml/2006/picture">
+                <pic:pic xmlns:pic="http://schemas.openxmlformats.org/drawingml/2006/picture">
+                  <pic:nvPicPr>
+                    <pic:cNvPr id="23427552" name=""/>
+                    <pic:cNvPicPr/>
+                  </pic:nvPicPr>
+                  <pic:blipFill>
+                    <a:blip r:embed="rId44"/>
+                    <a:stretch>
+                      <a:fillRect/>
+                    </a:stretch>
+                  </pic:blipFill>
+                  <pic:spPr>
+                    <a:xfrm>
+                      <a:off x="0" y="0"/>
+                      <a:ext cx="2324424" cy="1667108"/>
+                    </a:xfrm>
+                    <a:prstGeom prst="rect">
+                      <a:avLst/>
+                    </a:prstGeom>
+                  </pic:spPr>
+                </pic:pic>
+              </a:graphicData>
+            </a:graphic>
+          </wp:inline>
+        </w:drawing>
+      </w:r>
+    </w:p>
+    <w:p/>
+    <w:p>
+      <w:pPr>
+        <w:rPr>
+          <w:b/>
+          <w:bCs/>
+        </w:rPr>
+      </w:pPr>
+      <w:proofErr w:type="spellStart"/>
+      <w:r>
+        <w:rPr>
+          <w:b/>
+          <w:bCs/>
+        </w:rPr>
+        <w:t>while</w:t>
+      </w:r>
+      <w:proofErr w:type="spellEnd"/>
+      <w:r>
+        <w:rPr>
+          <w:b/>
+          <w:bCs/>
+        </w:rPr>
+        <w:t>-Schleife</w:t>
+      </w:r>
+    </w:p>
+    <w:p>
+      <w:r>
+        <w:t>Wird verwendet, solange eine Bedingung wahr ist:</w:t>
+      </w:r>
+    </w:p>
+    <w:p>
+      <w:r>
+        <w:drawing>
+          <wp:inline distT="0" distB="0" distL="0" distR="0" wp14:anchorId="4ECDBBEC" wp14:editId="45AF2992">
+            <wp:extent cx="1724038" cy="1209684"/>
+            <wp:effectExtent l="0" t="0" r="9525" b="9525"/>
+            <wp:docPr id="206975840" name="Grafik 1"/>
+            <wp:cNvGraphicFramePr>
+              <a:graphicFrameLocks xmlns:a="http://schemas.openxmlformats.org/drawingml/2006/main" noChangeAspect="1"/>
+            </wp:cNvGraphicFramePr>
+            <a:graphic xmlns:a="http://schemas.openxmlformats.org/drawingml/2006/main">
+              <a:graphicData uri="http://schemas.openxmlformats.org/drawingml/2006/picture">
+                <pic:pic xmlns:pic="http://schemas.openxmlformats.org/drawingml/2006/picture">
+                  <pic:nvPicPr>
+                    <pic:cNvPr id="206975840" name=""/>
+                    <pic:cNvPicPr/>
+                  </pic:nvPicPr>
+                  <pic:blipFill>
+                    <a:blip r:embed="rId45"/>
+                    <a:stretch>
+                      <a:fillRect/>
+                    </a:stretch>
+                  </pic:blipFill>
+                  <pic:spPr>
+                    <a:xfrm>
+                      <a:off x="0" y="0"/>
+                      <a:ext cx="1724038" cy="1209684"/>
+                    </a:xfrm>
+                    <a:prstGeom prst="rect">
+                      <a:avLst/>
+                    </a:prstGeom>
+                  </pic:spPr>
+                </pic:pic>
+              </a:graphicData>
+            </a:graphic>
+          </wp:inline>
+        </w:drawing>
+      </w:r>
+    </w:p>
+    <w:p>
+      <w:pPr>
+        <w:pStyle w:val="berschrift3"/>
+      </w:pPr>
+      <w:r>
+        <w:t xml:space="preserve">Ausgaben </w:t>
+      </w:r>
+      <w:proofErr w:type="spellStart"/>
+      <w:r>
+        <w:t>Inform.kanalstdin</w:t>
+      </w:r>
+      <w:proofErr w:type="spellEnd"/>
+    </w:p>
+    <w:p>
+      <w:r>
+        <w:t>Linux verwendet drei Standard-Datenströme:</w:t>
+      </w:r>
+    </w:p>
+    <w:tbl>
+      <w:tblPr>
+        <w:tblStyle w:val="Gitternetztabelle4Akzent1"/>
+        <w:tblW w:w="5462" w:type="dxa"/>
+        <w:tblLook w:val="04A0" w:firstRow="1" w:lastRow="0" w:firstColumn="1" w:lastColumn="0" w:noHBand="0" w:noVBand="1"/>
+      </w:tblPr>
+      <w:tblGrid>
+        <w:gridCol w:w="1213"/>
+        <w:gridCol w:w="2703"/>
+        <w:gridCol w:w="1546"/>
+      </w:tblGrid>
+      <w:tr>
+        <w:trPr>
+          <w:cnfStyle w:val="100000000000" w:firstRow="1" w:lastRow="0" w:firstColumn="0" w:lastColumn="0" w:oddVBand="0" w:evenVBand="0" w:oddHBand="0" w:evenHBand="0" w:firstRowFirstColumn="0" w:firstRowLastColumn="0" w:lastRowFirstColumn="0" w:lastRowLastColumn="0"/>
+          <w:trHeight w:val="542"/>
+        </w:trPr>
+        <w:tc>
+          <w:tcPr>
+            <w:cnfStyle w:val="001000000000" w:firstRow="0" w:lastRow="0" w:firstColumn="1" w:lastColumn="0" w:oddVBand="0" w:evenVBand="0" w:oddHBand="0" w:evenHBand="0" w:firstRowFirstColumn="0" w:firstRowLastColumn="0" w:lastRowFirstColumn="0" w:lastRowLastColumn="0"/>
+            <w:tcW w:w="0" w:type="auto"/>
+            <w:hideMark/>
+          </w:tcPr>
+          <w:p>
+            <w:pPr>
+              <w:spacing w:after="160" w:line="278" w:lineRule="auto"/>
+            </w:pPr>
+            <w:r>
+              <w:t>Kanal</w:t>
+            </w:r>
+          </w:p>
+        </w:tc>
+        <w:tc>
+          <w:tcPr>
+            <w:tcW w:w="0" w:type="auto"/>
+            <w:hideMark/>
+          </w:tcPr>
+          <w:p>
+            <w:pPr>
+              <w:spacing w:after="160" w:line="278" w:lineRule="auto"/>
+              <w:cnfStyle w:val="100000000000" w:firstRow="1" w:lastRow="0" w:firstColumn="0" w:lastColumn="0" w:oddVBand="0" w:evenVBand="0" w:oddHBand="0" w:evenHBand="0" w:firstRowFirstColumn="0" w:firstRowLastColumn="0" w:lastRowFirstColumn="0" w:lastRowLastColumn="0"/>
+            </w:pPr>
+            <w:r>
+              <w:t>Bedeutung</w:t>
+            </w:r>
+          </w:p>
+        </w:tc>
+        <w:tc>
+          <w:tcPr>
+            <w:tcW w:w="0" w:type="auto"/>
+            <w:hideMark/>
+          </w:tcPr>
+          <w:p>
+            <w:pPr>
+              <w:spacing w:after="160" w:line="278" w:lineRule="auto"/>
+              <w:cnfStyle w:val="100000000000" w:firstRow="1" w:lastRow="0" w:firstColumn="0" w:lastColumn="0" w:oddVBand="0" w:evenVBand="0" w:oddHBand="0" w:evenHBand="0" w:firstRowFirstColumn="0" w:firstRowLastColumn="0" w:lastRowFirstColumn="0" w:lastRowLastColumn="0"/>
+            </w:pPr>
+            <w:r>
+              <w:t>Nummer</w:t>
+            </w:r>
+          </w:p>
+        </w:tc>
+      </w:tr>
+      <w:tr>
+        <w:trPr>
+          <w:cnfStyle w:val="000000100000" w:firstRow="0" w:lastRow="0" w:firstColumn="0" w:lastColumn="0" w:oddVBand="0" w:evenVBand="0" w:oddHBand="1" w:evenHBand="0" w:firstRowFirstColumn="0" w:firstRowLastColumn="0" w:lastRowFirstColumn="0" w:lastRowLastColumn="0"/>
+          <w:trHeight w:val="533"/>
+        </w:trPr>
+        <w:tc>
+          <w:tcPr>
+            <w:cnfStyle w:val="001000000000" w:firstRow="0" w:lastRow="0" w:firstColumn="1" w:lastColumn="0" w:oddVBand="0" w:evenVBand="0" w:oddHBand="0" w:evenHBand="0" w:firstRowFirstColumn="0" w:firstRowLastColumn="0" w:lastRowFirstColumn="0" w:lastRowLastColumn="0"/>
+            <w:tcW w:w="0" w:type="auto"/>
+            <w:hideMark/>
+          </w:tcPr>
+          <w:p>
+            <w:pPr>
+              <w:spacing w:after="160" w:line="278" w:lineRule="auto"/>
+            </w:pPr>
+            <w:proofErr w:type="spellStart"/>
+            <w:r>
+              <w:t>stdin</w:t>
+            </w:r>
+            <w:proofErr w:type="spellEnd"/>
+          </w:p>
+        </w:tc>
+        <w:tc>
+          <w:tcPr>
+            <w:tcW w:w="0" w:type="auto"/>
+            <w:hideMark/>
+          </w:tcPr>
+          <w:p>
+            <w:pPr>
+              <w:spacing w:after="160" w:line="278" w:lineRule="auto"/>
+              <w:cnfStyle w:val="000000100000" w:firstRow="0" w:lastRow="0" w:firstColumn="0" w:lastColumn="0" w:oddVBand="0" w:evenVBand="0" w:oddHBand="1" w:evenHBand="0" w:firstRowFirstColumn="0" w:firstRowLastColumn="0" w:lastRowFirstColumn="0" w:lastRowLastColumn="0"/>
+            </w:pPr>
+            <w:r>
+              <w:t>Eingabe</w:t>
+            </w:r>
+          </w:p>
+        </w:tc>
+        <w:tc>
+          <w:tcPr>
+            <w:tcW w:w="0" w:type="auto"/>
+            <w:hideMark/>
+          </w:tcPr>
+          <w:p>
+            <w:pPr>
+              <w:spacing w:after="160" w:line="278" w:lineRule="auto"/>
+              <w:cnfStyle w:val="000000100000" w:firstRow="0" w:lastRow="0" w:firstColumn="0" w:lastColumn="0" w:oddVBand="0" w:evenVBand="0" w:oddHBand="1" w:evenHBand="0" w:firstRowFirstColumn="0" w:firstRowLastColumn="0" w:lastRowFirstColumn="0" w:lastRowLastColumn="0"/>
+            </w:pPr>
+            <w:r>
+              <w:t>0</w:t>
+            </w:r>
+          </w:p>
+        </w:tc>
+      </w:tr>
+      <w:tr>
+        <w:trPr>
+          <w:trHeight w:val="542"/>
+        </w:trPr>
+        <w:tc>
+          <w:tcPr>
+            <w:cnfStyle w:val="001000000000" w:firstRow="0" w:lastRow="0" w:firstColumn="1" w:lastColumn="0" w:oddVBand="0" w:evenVBand="0" w:oddHBand="0" w:evenHBand="0" w:firstRowFirstColumn="0" w:firstRowLastColumn="0" w:lastRowFirstColumn="0" w:lastRowLastColumn="0"/>
+            <w:tcW w:w="0" w:type="auto"/>
+            <w:hideMark/>
+          </w:tcPr>
+          <w:p>
+            <w:pPr>
+              <w:spacing w:after="160" w:line="278" w:lineRule="auto"/>
+            </w:pPr>
+            <w:r>
+              <w:t>stdout</w:t>
+            </w:r>
+          </w:p>
+        </w:tc>
+        <w:tc>
+          <w:tcPr>
+            <w:tcW w:w="0" w:type="auto"/>
+            <w:hideMark/>
+          </w:tcPr>
+          <w:p>
+            <w:pPr>
+              <w:spacing w:after="160" w:line="278" w:lineRule="auto"/>
+              <w:cnfStyle w:val="000000000000" w:firstRow="0" w:lastRow="0" w:firstColumn="0" w:lastColumn="0" w:oddVBand="0" w:evenVBand="0" w:oddHBand="0" w:evenHBand="0" w:firstRowFirstColumn="0" w:firstRowLastColumn="0" w:lastRowFirstColumn="0" w:lastRowLastColumn="0"/>
+            </w:pPr>
+            <w:r>
+              <w:t>Normale Ausgabe</w:t>
+            </w:r>
+          </w:p>
+        </w:tc>
+        <w:tc>
+          <w:tcPr>
+            <w:tcW w:w="0" w:type="auto"/>
+            <w:hideMark/>
+          </w:tcPr>
+          <w:p>
+            <w:pPr>
+              <w:spacing w:after="160" w:line="278" w:lineRule="auto"/>
+              <w:cnfStyle w:val="000000000000" w:firstRow="0" w:lastRow="0" w:firstColumn="0" w:lastColumn="0" w:oddVBand="0" w:evenVBand="0" w:oddHBand="0" w:evenHBand="0" w:firstRowFirstColumn="0" w:firstRowLastColumn="0" w:lastRowFirstColumn="0" w:lastRowLastColumn="0"/>
+            </w:pPr>
+            <w:r>
+              <w:t>1</w:t>
+            </w:r>
+          </w:p>
+        </w:tc>
+      </w:tr>
+      <w:tr>
+        <w:trPr>
+          <w:cnfStyle w:val="000000100000" w:firstRow="0" w:lastRow="0" w:firstColumn="0" w:lastColumn="0" w:oddVBand="0" w:evenVBand="0" w:oddHBand="1" w:evenHBand="0" w:firstRowFirstColumn="0" w:firstRowLastColumn="0" w:lastRowFirstColumn="0" w:lastRowLastColumn="0"/>
+          <w:trHeight w:val="542"/>
+        </w:trPr>
+        <w:tc>
+          <w:tcPr>
+            <w:cnfStyle w:val="001000000000" w:firstRow="0" w:lastRow="0" w:firstColumn="1" w:lastColumn="0" w:oddVBand="0" w:evenVBand="0" w:oddHBand="0" w:evenHBand="0" w:firstRowFirstColumn="0" w:firstRowLastColumn="0" w:lastRowFirstColumn="0" w:lastRowLastColumn="0"/>
+            <w:tcW w:w="0" w:type="auto"/>
+            <w:hideMark/>
+          </w:tcPr>
+          <w:p>
+            <w:pPr>
+              <w:spacing w:after="160" w:line="278" w:lineRule="auto"/>
+            </w:pPr>
+            <w:r>
+              <w:t>stderr</w:t>
+            </w:r>
+          </w:p>
+        </w:tc>
+        <w:tc>
+          <w:tcPr>
+            <w:tcW w:w="0" w:type="auto"/>
+            <w:hideMark/>
+          </w:tcPr>
+          <w:p>
+            <w:pPr>
+              <w:spacing w:after="160" w:line="278" w:lineRule="auto"/>
+              <w:cnfStyle w:val="000000100000" w:firstRow="0" w:lastRow="0" w:firstColumn="0" w:lastColumn="0" w:oddVBand="0" w:evenVBand="0" w:oddHBand="1" w:evenHBand="0" w:firstRowFirstColumn="0" w:firstRowLastColumn="0" w:lastRowFirstColumn="0" w:lastRowLastColumn="0"/>
+            </w:pPr>
+            <w:r>
+              <w:t>Fehlermeldungen</w:t>
+            </w:r>
+          </w:p>
+        </w:tc>
+        <w:tc>
+          <w:tcPr>
+            <w:tcW w:w="0" w:type="auto"/>
+            <w:hideMark/>
+          </w:tcPr>
+          <w:p>
+            <w:pPr>
+              <w:spacing w:after="160" w:line="278" w:lineRule="auto"/>
+              <w:cnfStyle w:val="000000100000" w:firstRow="0" w:lastRow="0" w:firstColumn="0" w:lastColumn="0" w:oddVBand="0" w:evenVBand="0" w:oddHBand="1" w:evenHBand="0" w:firstRowFirstColumn="0" w:firstRowLastColumn="0" w:lastRowFirstColumn="0" w:lastRowLastColumn="0"/>
+            </w:pPr>
+            <w:r>
+              <w:t>2</w:t>
+            </w:r>
+          </w:p>
+        </w:tc>
+      </w:tr>
+    </w:tbl>
+    <w:p/>
+    <w:p>
+      <w:proofErr w:type="spellStart"/>
+      <w:r>
+        <w:t>Stdin</w:t>
+      </w:r>
+      <w:proofErr w:type="spellEnd"/>
+      <w:r>
+        <w:t xml:space="preserve"> </w:t>
+      </w:r>
+      <w:r>
+        <w:sym w:font="Wingdings" w:char="F0E0"/>
+      </w:r>
+      <w:r>
+        <w:t xml:space="preserve"> Das ist die Eingabe für ein Programm </w:t>
+      </w:r>
+    </w:p>
+    <w:p>
+      <w:r>
+        <w:t xml:space="preserve">Man kann etwas eintippen das ist </w:t>
+      </w:r>
+      <w:proofErr w:type="spellStart"/>
+      <w:r>
+        <w:t>stdin</w:t>
+      </w:r>
+      <w:proofErr w:type="spellEnd"/>
+      <w:r>
+        <w:t xml:space="preserve"> der Inhalt einer Datei wird auch als Eingabe genommen.</w:t>
+      </w:r>
+    </w:p>
+    <w:p>
+      <w:r>
+        <w:lastRenderedPageBreak/>
+        <w:t xml:space="preserve">Stdout </w:t>
+      </w:r>
+      <w:r>
+        <w:sym w:font="Wingdings" w:char="F0E0"/>
+      </w:r>
+      <w:r>
+        <w:t xml:space="preserve"> </w:t>
+      </w:r>
+      <w:r>
+        <w:t xml:space="preserve">Das ist </w:t>
+      </w:r>
+      <w:r>
+        <w:t>die normale Ausgabe eines Programms</w:t>
+      </w:r>
+      <w:r>
+        <w:t xml:space="preserve"> </w:t>
+      </w:r>
+    </w:p>
+    <w:p>
+      <w:r>
+        <w:t xml:space="preserve">Das </w:t>
+      </w:r>
+      <w:r>
+        <w:t>Ganze</w:t>
+      </w:r>
+      <w:r>
+        <w:t xml:space="preserve"> ist meist in der Konsole. </w:t>
+      </w:r>
+    </w:p>
+    <w:p>
+      <w:r>
+        <w:drawing>
+          <wp:inline distT="0" distB="0" distL="0" distR="0" wp14:anchorId="45DBEDBE" wp14:editId="213C5E74">
+            <wp:extent cx="3839111" cy="628738"/>
+            <wp:effectExtent l="0" t="0" r="0" b="0"/>
+            <wp:docPr id="694234112" name="Grafik 1"/>
+            <wp:cNvGraphicFramePr>
+              <a:graphicFrameLocks xmlns:a="http://schemas.openxmlformats.org/drawingml/2006/main" noChangeAspect="1"/>
+            </wp:cNvGraphicFramePr>
+            <a:graphic xmlns:a="http://schemas.openxmlformats.org/drawingml/2006/main">
+              <a:graphicData uri="http://schemas.openxmlformats.org/drawingml/2006/picture">
+                <pic:pic xmlns:pic="http://schemas.openxmlformats.org/drawingml/2006/picture">
+                  <pic:nvPicPr>
+                    <pic:cNvPr id="694234112" name=""/>
+                    <pic:cNvPicPr/>
+                  </pic:nvPicPr>
+                  <pic:blipFill>
+                    <a:blip r:embed="rId46"/>
+                    <a:stretch>
+                      <a:fillRect/>
+                    </a:stretch>
+                  </pic:blipFill>
+                  <pic:spPr>
+                    <a:xfrm>
+                      <a:off x="0" y="0"/>
+                      <a:ext cx="3839111" cy="628738"/>
+                    </a:xfrm>
+                    <a:prstGeom prst="rect">
+                      <a:avLst/>
+                    </a:prstGeom>
+                  </pic:spPr>
+                </pic:pic>
+              </a:graphicData>
+            </a:graphic>
+          </wp:inline>
+        </w:drawing>
+      </w:r>
+    </w:p>
+    <w:p>
+      <w:r>
+        <w:t xml:space="preserve">Hier geht die </w:t>
+      </w:r>
+      <w:r>
+        <w:t>Ausgabe</w:t>
+      </w:r>
+      <w:r>
+        <w:t xml:space="preserve"> nicht in die </w:t>
+      </w:r>
+      <w:r>
+        <w:t>Konsole,</w:t>
+      </w:r>
+      <w:r>
+        <w:t xml:space="preserve"> sondern in die datei.txt. </w:t>
+      </w:r>
+    </w:p>
+    <w:p>
+      <w:r>
+        <w:t xml:space="preserve">Mit &gt; wir Datei überschrieben und mit &gt;&gt; wir das ganze eingefügt. </w:t>
+      </w:r>
+    </w:p>
+    <w:p>
+      <w:r>
+        <w:t>stderr (</w:t>
+      </w:r>
+      <w:proofErr w:type="gramStart"/>
+      <w:r>
+        <w:t>Standard Error</w:t>
+      </w:r>
+      <w:proofErr w:type="gramEnd"/>
+      <w:r>
+        <w:t>)</w:t>
+      </w:r>
+    </w:p>
+    <w:p>
+      <w:r>
+        <w:t xml:space="preserve">Das ist der Kanal für </w:t>
+      </w:r>
+      <w:r>
+        <w:rPr>
+          <w:b/>
+          <w:bCs/>
+        </w:rPr>
+        <w:t>Fehlermeldungen</w:t>
+      </w:r>
+    </w:p>
+    <w:p>
+      <w:r>
+        <w:t>Standardmässig:</w:t>
+      </w:r>
+      <w:r>
+        <w:br/>
+        <w:t>auch im Terminal sichtbar (wie stdout)</w:t>
+      </w:r>
+    </w:p>
+    <w:p>
+      <w:pPr>
+        <w:pStyle w:val="berschrift3"/>
+      </w:pPr>
+      <w:r>
+        <w:t>P</w:t>
+      </w:r>
+      <w:r>
+        <w:t>iep</w:t>
+      </w:r>
+      <w:r>
+        <w:t xml:space="preserve"> | </w:t>
+      </w:r>
+    </w:p>
+    <w:p>
+      <w:r>
+        <w:t>Mit einer Pipe verbindest du Programme:</w:t>
+      </w:r>
+    </w:p>
+    <w:p>
+      <w:r>
+        <w:t>Output von Befehl 1 → Input von Befehl 2</w:t>
+      </w:r>
+    </w:p>
+    <w:p>
+      <w:r>
+        <w:drawing>
+          <wp:inline distT="0" distB="0" distL="0" distR="0" wp14:anchorId="2327C347" wp14:editId="477B384F">
+            <wp:extent cx="2381582" cy="628738"/>
+            <wp:effectExtent l="0" t="0" r="0" b="0"/>
+            <wp:docPr id="1039255890" name="Grafik 1"/>
+            <wp:cNvGraphicFramePr>
+              <a:graphicFrameLocks xmlns:a="http://schemas.openxmlformats.org/drawingml/2006/main" noChangeAspect="1"/>
+            </wp:cNvGraphicFramePr>
+            <a:graphic xmlns:a="http://schemas.openxmlformats.org/drawingml/2006/main">
+              <a:graphicData uri="http://schemas.openxmlformats.org/drawingml/2006/picture">
+                <pic:pic xmlns:pic="http://schemas.openxmlformats.org/drawingml/2006/picture">
+                  <pic:nvPicPr>
+                    <pic:cNvPr id="1039255890" name=""/>
+                    <pic:cNvPicPr/>
+                  </pic:nvPicPr>
+                  <pic:blipFill>
+                    <a:blip r:embed="rId47"/>
+                    <a:stretch>
+                      <a:fillRect/>
+                    </a:stretch>
+                  </pic:blipFill>
+                  <pic:spPr>
+                    <a:xfrm>
+                      <a:off x="0" y="0"/>
+                      <a:ext cx="2381582" cy="628738"/>
+                    </a:xfrm>
+                    <a:prstGeom prst="rect">
+                      <a:avLst/>
+                    </a:prstGeom>
+                  </pic:spPr>
+                </pic:pic>
+              </a:graphicData>
+            </a:graphic>
+          </wp:inline>
+        </w:drawing>
+      </w:r>
+    </w:p>
+    <w:p>
+      <w:proofErr w:type="spellStart"/>
+      <w:r>
+        <w:t>ls</w:t>
+      </w:r>
+      <w:proofErr w:type="spellEnd"/>
+      <w:r>
+        <w:t xml:space="preserve"> gibt aus → </w:t>
+      </w:r>
+      <w:proofErr w:type="spellStart"/>
+      <w:r>
+        <w:t>grep</w:t>
+      </w:r>
+      <w:proofErr w:type="spellEnd"/>
+      <w:r>
+        <w:t xml:space="preserve"> filtert</w:t>
+      </w:r>
+    </w:p>
+    <w:p>
+      <w:pPr>
+        <w:pStyle w:val="berschrift3"/>
+      </w:pPr>
+      <w:r>
+        <w:t xml:space="preserve">Debuggen </w:t>
+      </w:r>
+    </w:p>
+    <w:p>
+      <w:proofErr w:type="spellStart"/>
+      <w:r>
+        <w:t>Script</w:t>
+      </w:r>
+      <w:proofErr w:type="spellEnd"/>
+      <w:r>
+        <w:t xml:space="preserve"> debuggen</w:t>
+      </w:r>
+    </w:p>
+    <w:p>
+      <w:r>
+        <w:drawing>
+          <wp:inline distT="0" distB="0" distL="0" distR="0" wp14:anchorId="62E192D9" wp14:editId="02CB7ACF">
+            <wp:extent cx="2772162" cy="704948"/>
+            <wp:effectExtent l="0" t="0" r="9525" b="0"/>
+            <wp:docPr id="34615108" name="Grafik 1"/>
+            <wp:cNvGraphicFramePr>
+              <a:graphicFrameLocks xmlns:a="http://schemas.openxmlformats.org/drawingml/2006/main" noChangeAspect="1"/>
+            </wp:cNvGraphicFramePr>
+            <a:graphic xmlns:a="http://schemas.openxmlformats.org/drawingml/2006/main">
+              <a:graphicData uri="http://schemas.openxmlformats.org/drawingml/2006/picture">
+                <pic:pic xmlns:pic="http://schemas.openxmlformats.org/drawingml/2006/picture">
+                  <pic:nvPicPr>
+                    <pic:cNvPr id="34615108" name=""/>
+                    <pic:cNvPicPr/>
+                  </pic:nvPicPr>
+                  <pic:blipFill>
+                    <a:blip r:embed="rId48"/>
+                    <a:stretch>
+                      <a:fillRect/>
+                    </a:stretch>
+                  </pic:blipFill>
+                  <pic:spPr>
+                    <a:xfrm>
+                      <a:off x="0" y="0"/>
+                      <a:ext cx="2772162" cy="704948"/>
+                    </a:xfrm>
+                    <a:prstGeom prst="rect">
+                      <a:avLst/>
+                    </a:prstGeom>
+                  </pic:spPr>
+                </pic:pic>
+              </a:graphicData>
+            </a:graphic>
+          </wp:inline>
+        </w:drawing>
+      </w:r>
+    </w:p>
+    <w:p>
+      <w:r>
+        <w:t xml:space="preserve">zeigt jeden Schritt im </w:t>
+      </w:r>
+      <w:proofErr w:type="spellStart"/>
+      <w:r>
+        <w:t>Script</w:t>
+      </w:r>
+      <w:proofErr w:type="spellEnd"/>
+    </w:p>
+    <w:p>
+      <w:pPr>
+        <w:pStyle w:val="berschrift3"/>
+      </w:pPr>
+      <w:proofErr w:type="spellStart"/>
+      <w:r>
+        <w:t>Script</w:t>
+      </w:r>
+      <w:proofErr w:type="spellEnd"/>
+      <w:r>
+        <w:t xml:space="preserve"> einbinden &amp; testen</w:t>
+      </w:r>
+    </w:p>
+    <w:p>
+      <w:r>
+        <w:t>ausführbar machen</w:t>
+      </w:r>
+    </w:p>
+    <w:p>
+      <w:r>
+        <w:drawing>
+          <wp:inline distT="0" distB="0" distL="0" distR="0" wp14:anchorId="1C0558A0" wp14:editId="1425A3E1">
+            <wp:extent cx="2781688" cy="676369"/>
+            <wp:effectExtent l="0" t="0" r="0" b="9525"/>
+            <wp:docPr id="386688611" name="Grafik 1"/>
+            <wp:cNvGraphicFramePr>
+              <a:graphicFrameLocks xmlns:a="http://schemas.openxmlformats.org/drawingml/2006/main" noChangeAspect="1"/>
+            </wp:cNvGraphicFramePr>
+            <a:graphic xmlns:a="http://schemas.openxmlformats.org/drawingml/2006/main">
+              <a:graphicData uri="http://schemas.openxmlformats.org/drawingml/2006/picture">
+                <pic:pic xmlns:pic="http://schemas.openxmlformats.org/drawingml/2006/picture">
+                  <pic:nvPicPr>
+                    <pic:cNvPr id="386688611" name=""/>
+                    <pic:cNvPicPr/>
+                  </pic:nvPicPr>
+                  <pic:blipFill>
+                    <a:blip r:embed="rId49"/>
+                    <a:stretch>
+                      <a:fillRect/>
+                    </a:stretch>
+                  </pic:blipFill>
+                  <pic:spPr>
+                    <a:xfrm>
+                      <a:off x="0" y="0"/>
+                      <a:ext cx="2781688" cy="676369"/>
+                    </a:xfrm>
+                    <a:prstGeom prst="rect">
+                      <a:avLst/>
+                    </a:prstGeom>
+                  </pic:spPr>
+                </pic:pic>
+              </a:graphicData>
+            </a:graphic>
+          </wp:inline>
+        </w:drawing>
+      </w:r>
+    </w:p>
+    <w:p>
+      <w:r>
+        <w:t>A</w:t>
+      </w:r>
+      <w:r>
+        <w:t>usführen</w:t>
+      </w:r>
+    </w:p>
+    <w:p>
+      <w:r>
+        <w:lastRenderedPageBreak/>
+        <w:drawing>
+          <wp:inline distT="0" distB="0" distL="0" distR="0" wp14:anchorId="7574CBF4" wp14:editId="1CC1370B">
+            <wp:extent cx="1790950" cy="733527"/>
+            <wp:effectExtent l="0" t="0" r="0" b="9525"/>
+            <wp:docPr id="154759423" name="Grafik 1"/>
+            <wp:cNvGraphicFramePr>
+              <a:graphicFrameLocks xmlns:a="http://schemas.openxmlformats.org/drawingml/2006/main" noChangeAspect="1"/>
+            </wp:cNvGraphicFramePr>
+            <a:graphic xmlns:a="http://schemas.openxmlformats.org/drawingml/2006/main">
+              <a:graphicData uri="http://schemas.openxmlformats.org/drawingml/2006/picture">
+                <pic:pic xmlns:pic="http://schemas.openxmlformats.org/drawingml/2006/picture">
+                  <pic:nvPicPr>
+                    <pic:cNvPr id="154759423" name=""/>
+                    <pic:cNvPicPr/>
+                  </pic:nvPicPr>
+                  <pic:blipFill>
+                    <a:blip r:embed="rId50"/>
+                    <a:stretch>
+                      <a:fillRect/>
+                    </a:stretch>
+                  </pic:blipFill>
+                  <pic:spPr>
+                    <a:xfrm>
+                      <a:off x="0" y="0"/>
+                      <a:ext cx="1790950" cy="733527"/>
+                    </a:xfrm>
+                    <a:prstGeom prst="rect">
+                      <a:avLst/>
+                    </a:prstGeom>
+                  </pic:spPr>
+                </pic:pic>
+              </a:graphicData>
+            </a:graphic>
+          </wp:inline>
+        </w:drawing>
+      </w:r>
+    </w:p>
+    <w:p>
+      <w:r>
+        <w:t>auf Server kopieren</w:t>
+      </w:r>
+    </w:p>
+    <w:p>
+      <w:r>
+        <w:drawing>
+          <wp:inline distT="0" distB="0" distL="0" distR="0" wp14:anchorId="627C48B9" wp14:editId="54FED87E">
+            <wp:extent cx="4753638" cy="609685"/>
+            <wp:effectExtent l="0" t="0" r="8890" b="0"/>
+            <wp:docPr id="624439058" name="Grafik 1"/>
+            <wp:cNvGraphicFramePr>
+              <a:graphicFrameLocks xmlns:a="http://schemas.openxmlformats.org/drawingml/2006/main" noChangeAspect="1"/>
+            </wp:cNvGraphicFramePr>
+            <a:graphic xmlns:a="http://schemas.openxmlformats.org/drawingml/2006/main">
+              <a:graphicData uri="http://schemas.openxmlformats.org/drawingml/2006/picture">
+                <pic:pic xmlns:pic="http://schemas.openxmlformats.org/drawingml/2006/picture">
+                  <pic:nvPicPr>
+                    <pic:cNvPr id="624439058" name=""/>
+                    <pic:cNvPicPr/>
+                  </pic:nvPicPr>
+                  <pic:blipFill>
+                    <a:blip r:embed="rId51"/>
+                    <a:stretch>
+                      <a:fillRect/>
+                    </a:stretch>
+                  </pic:blipFill>
+                  <pic:spPr>
+                    <a:xfrm>
+                      <a:off x="0" y="0"/>
+                      <a:ext cx="4753638" cy="609685"/>
+                    </a:xfrm>
+                    <a:prstGeom prst="rect">
+                      <a:avLst/>
+                    </a:prstGeom>
+                  </pic:spPr>
+                </pic:pic>
+              </a:graphicData>
+            </a:graphic>
+          </wp:inline>
+        </w:drawing>
+      </w:r>
+    </w:p>
+    <w:p/>
     <w:sectPr>
-      <w:headerReference w:type="default" r:id="rId43"/>
-      <w:footerReference w:type="default" r:id="rId44"/>
-      <w:headerReference w:type="first" r:id="rId45"/>
+      <w:headerReference w:type="default" r:id="rId52"/>
+      <w:footerReference w:type="default" r:id="rId53"/>
+      <w:headerReference w:type="first" r:id="rId54"/>
       <w:pgSz w:w="11906" w:h="16838"/>
       <w:pgMar w:top="1417" w:right="1417" w:bottom="1134" w:left="1417" w:header="709" w:footer="680" w:gutter="0"/>
       <w:pgNumType w:start="0"/>
@@ -5333,7 +6569,7 @@
       <w:rPr>
         <w:noProof/>
       </w:rPr>
-      <w:t>11.03.2026</w:t>
+      <w:t>18.03.2026</w:t>
     </w:r>
     <w:r>
       <w:fldChar w:fldCharType="end"/>
@@ -5892,9 +7128,9 @@
     </w:lvl>
   </w:abstractNum>
   <w:abstractNum w:abstractNumId="3" w15:restartNumberingAfterBreak="0">
-    <w:nsid w:val="5AB06A44"/>
+    <w:nsid w:val="4E207514"/>
     <w:multiLevelType w:val="multilevel"/>
-    <w:tmpl w:val="ED4E8C26"/>
+    <w:tmpl w:val="C8EA494E"/>
     <w:lvl w:ilvl="0">
       <w:start w:val="1"/>
       <w:numFmt w:val="bullet"/>
@@ -6041,9 +7277,9 @@
     </w:lvl>
   </w:abstractNum>
   <w:abstractNum w:abstractNumId="4" w15:restartNumberingAfterBreak="0">
-    <w:nsid w:val="775678DE"/>
+    <w:nsid w:val="5AB06A44"/>
     <w:multiLevelType w:val="multilevel"/>
-    <w:tmpl w:val="7AEAFAF6"/>
+    <w:tmpl w:val="ED4E8C26"/>
     <w:lvl w:ilvl="0">
       <w:start w:val="1"/>
       <w:numFmt w:val="bullet"/>
@@ -6189,11 +7425,160 @@
       </w:rPr>
     </w:lvl>
   </w:abstractNum>
+  <w:abstractNum w:abstractNumId="5" w15:restartNumberingAfterBreak="0">
+    <w:nsid w:val="775678DE"/>
+    <w:multiLevelType w:val="multilevel"/>
+    <w:tmpl w:val="7AEAFAF6"/>
+    <w:lvl w:ilvl="0">
+      <w:start w:val="1"/>
+      <w:numFmt w:val="bullet"/>
+      <w:lvlText w:val=""/>
+      <w:lvlJc w:val="left"/>
+      <w:pPr>
+        <w:tabs>
+          <w:tab w:val="num" w:pos="720"/>
+        </w:tabs>
+        <w:ind w:left="720" w:hanging="360"/>
+      </w:pPr>
+      <w:rPr>
+        <w:rFonts w:ascii="Symbol" w:hAnsi="Symbol" w:hint="default"/>
+        <w:sz w:val="20"/>
+      </w:rPr>
+    </w:lvl>
+    <w:lvl w:ilvl="1" w:tentative="1">
+      <w:start w:val="1"/>
+      <w:numFmt w:val="bullet"/>
+      <w:lvlText w:val="o"/>
+      <w:lvlJc w:val="left"/>
+      <w:pPr>
+        <w:tabs>
+          <w:tab w:val="num" w:pos="1440"/>
+        </w:tabs>
+        <w:ind w:left="1440" w:hanging="360"/>
+      </w:pPr>
+      <w:rPr>
+        <w:rFonts w:ascii="Courier New" w:hAnsi="Courier New" w:hint="default"/>
+        <w:sz w:val="20"/>
+      </w:rPr>
+    </w:lvl>
+    <w:lvl w:ilvl="2" w:tentative="1">
+      <w:start w:val="1"/>
+      <w:numFmt w:val="bullet"/>
+      <w:lvlText w:val=""/>
+      <w:lvlJc w:val="left"/>
+      <w:pPr>
+        <w:tabs>
+          <w:tab w:val="num" w:pos="2160"/>
+        </w:tabs>
+        <w:ind w:left="2160" w:hanging="360"/>
+      </w:pPr>
+      <w:rPr>
+        <w:rFonts w:ascii="Wingdings" w:hAnsi="Wingdings" w:hint="default"/>
+        <w:sz w:val="20"/>
+      </w:rPr>
+    </w:lvl>
+    <w:lvl w:ilvl="3" w:tentative="1">
+      <w:start w:val="1"/>
+      <w:numFmt w:val="bullet"/>
+      <w:lvlText w:val=""/>
+      <w:lvlJc w:val="left"/>
+      <w:pPr>
+        <w:tabs>
+          <w:tab w:val="num" w:pos="2880"/>
+        </w:tabs>
+        <w:ind w:left="2880" w:hanging="360"/>
+      </w:pPr>
+      <w:rPr>
+        <w:rFonts w:ascii="Wingdings" w:hAnsi="Wingdings" w:hint="default"/>
+        <w:sz w:val="20"/>
+      </w:rPr>
+    </w:lvl>
+    <w:lvl w:ilvl="4" w:tentative="1">
+      <w:start w:val="1"/>
+      <w:numFmt w:val="bullet"/>
+      <w:lvlText w:val=""/>
+      <w:lvlJc w:val="left"/>
+      <w:pPr>
+        <w:tabs>
+          <w:tab w:val="num" w:pos="3600"/>
+        </w:tabs>
+        <w:ind w:left="3600" w:hanging="360"/>
+      </w:pPr>
+      <w:rPr>
+        <w:rFonts w:ascii="Wingdings" w:hAnsi="Wingdings" w:hint="default"/>
+        <w:sz w:val="20"/>
+      </w:rPr>
+    </w:lvl>
+    <w:lvl w:ilvl="5" w:tentative="1">
+      <w:start w:val="1"/>
+      <w:numFmt w:val="bullet"/>
+      <w:lvlText w:val=""/>
+      <w:lvlJc w:val="left"/>
+      <w:pPr>
+        <w:tabs>
+          <w:tab w:val="num" w:pos="4320"/>
+        </w:tabs>
+        <w:ind w:left="4320" w:hanging="360"/>
+      </w:pPr>
+      <w:rPr>
+        <w:rFonts w:ascii="Wingdings" w:hAnsi="Wingdings" w:hint="default"/>
+        <w:sz w:val="20"/>
+      </w:rPr>
+    </w:lvl>
+    <w:lvl w:ilvl="6" w:tentative="1">
+      <w:start w:val="1"/>
+      <w:numFmt w:val="bullet"/>
+      <w:lvlText w:val=""/>
+      <w:lvlJc w:val="left"/>
+      <w:pPr>
+        <w:tabs>
+          <w:tab w:val="num" w:pos="5040"/>
+        </w:tabs>
+        <w:ind w:left="5040" w:hanging="360"/>
+      </w:pPr>
+      <w:rPr>
+        <w:rFonts w:ascii="Wingdings" w:hAnsi="Wingdings" w:hint="default"/>
+        <w:sz w:val="20"/>
+      </w:rPr>
+    </w:lvl>
+    <w:lvl w:ilvl="7" w:tentative="1">
+      <w:start w:val="1"/>
+      <w:numFmt w:val="bullet"/>
+      <w:lvlText w:val=""/>
+      <w:lvlJc w:val="left"/>
+      <w:pPr>
+        <w:tabs>
+          <w:tab w:val="num" w:pos="5760"/>
+        </w:tabs>
+        <w:ind w:left="5760" w:hanging="360"/>
+      </w:pPr>
+      <w:rPr>
+        <w:rFonts w:ascii="Wingdings" w:hAnsi="Wingdings" w:hint="default"/>
+        <w:sz w:val="20"/>
+      </w:rPr>
+    </w:lvl>
+    <w:lvl w:ilvl="8" w:tentative="1">
+      <w:start w:val="1"/>
+      <w:numFmt w:val="bullet"/>
+      <w:lvlText w:val=""/>
+      <w:lvlJc w:val="left"/>
+      <w:pPr>
+        <w:tabs>
+          <w:tab w:val="num" w:pos="6480"/>
+        </w:tabs>
+        <w:ind w:left="6480" w:hanging="360"/>
+      </w:pPr>
+      <w:rPr>
+        <w:rFonts w:ascii="Wingdings" w:hAnsi="Wingdings" w:hint="default"/>
+        <w:sz w:val="20"/>
+      </w:rPr>
+    </w:lvl>
+  </w:abstractNum>
   <w:num w:numId="1" w16cid:durableId="939600998">
     <w:abstractNumId w:val="0"/>
   </w:num>
   <w:num w:numId="2" w16cid:durableId="477305743">
-    <w:abstractNumId w:val="4"/>
+    <w:abstractNumId w:val="5"/>
   </w:num>
   <w:num w:numId="3" w16cid:durableId="209194459">
     <w:abstractNumId w:val="1"/>
@@ -6202,6 +7587,9 @@
     <w:abstractNumId w:val="2"/>
   </w:num>
   <w:num w:numId="5" w16cid:durableId="2062627918">
+    <w:abstractNumId w:val="4"/>
+  </w:num>
+  <w:num w:numId="6" w16cid:durableId="1656178389">
     <w:abstractNumId w:val="3"/>
   </w:num>
 </w:numbering>
@@ -7335,6 +8723,82 @@
       </w:tblBorders>
     </w:tblPr>
   </w:style>
+  <w:style w:type="table" w:styleId="Gitternetztabelle4Akzent1">
+    <w:name w:val="Grid Table 4 Accent 1"/>
+    <w:basedOn w:val="NormaleTabelle"/>
+    <w:uiPriority w:val="49"/>
+    <w:rsid w:val="008856DD"/>
+    <w:pPr>
+      <w:spacing w:after="0" w:line="240" w:lineRule="auto"/>
+    </w:pPr>
+    <w:tblPr>
+      <w:tblStyleRowBandSize w:val="1"/>
+      <w:tblStyleColBandSize w:val="1"/>
+      <w:tblBorders>
+        <w:top w:val="single" w:sz="4" w:space="0" w:color="45B0E1" w:themeColor="accent1" w:themeTint="99"/>
+        <w:left w:val="single" w:sz="4" w:space="0" w:color="45B0E1" w:themeColor="accent1" w:themeTint="99"/>
+        <w:bottom w:val="single" w:sz="4" w:space="0" w:color="45B0E1" w:themeColor="accent1" w:themeTint="99"/>
+        <w:right w:val="single" w:sz="4" w:space="0" w:color="45B0E1" w:themeColor="accent1" w:themeTint="99"/>
+        <w:insideH w:val="single" w:sz="4" w:space="0" w:color="45B0E1" w:themeColor="accent1" w:themeTint="99"/>
+        <w:insideV w:val="single" w:sz="4" w:space="0" w:color="45B0E1" w:themeColor="accent1" w:themeTint="99"/>
+      </w:tblBorders>
+    </w:tblPr>
+    <w:tblStylePr w:type="firstRow">
+      <w:rPr>
+        <w:b/>
+        <w:bCs/>
+        <w:color w:val="FFFFFF" w:themeColor="background1"/>
+      </w:rPr>
+      <w:tblPr/>
+      <w:tcPr>
+        <w:tcBorders>
+          <w:top w:val="single" w:sz="4" w:space="0" w:color="156082" w:themeColor="accent1"/>
+          <w:left w:val="single" w:sz="4" w:space="0" w:color="156082" w:themeColor="accent1"/>
+          <w:bottom w:val="single" w:sz="4" w:space="0" w:color="156082" w:themeColor="accent1"/>
+          <w:right w:val="single" w:sz="4" w:space="0" w:color="156082" w:themeColor="accent1"/>
+          <w:insideH w:val="nil"/>
+          <w:insideV w:val="nil"/>
+        </w:tcBorders>
+        <w:shd w:val="clear" w:color="auto" w:fill="156082" w:themeFill="accent1"/>
+      </w:tcPr>
+    </w:tblStylePr>
+    <w:tblStylePr w:type="lastRow">
+      <w:rPr>
+        <w:b/>
+        <w:bCs/>
+      </w:rPr>
+      <w:tblPr/>
+      <w:tcPr>
+        <w:tcBorders>
+          <w:top w:val="double" w:sz="4" w:space="0" w:color="156082" w:themeColor="accent1"/>
+        </w:tcBorders>
+      </w:tcPr>
+    </w:tblStylePr>
+    <w:tblStylePr w:type="firstCol">
+      <w:rPr>
+        <w:b/>
+        <w:bCs/>
+      </w:rPr>
+    </w:tblStylePr>
+    <w:tblStylePr w:type="lastCol">
+      <w:rPr>
+        <w:b/>
+        <w:bCs/>
+      </w:rPr>
+    </w:tblStylePr>
+    <w:tblStylePr w:type="band1Vert">
+      <w:tblPr/>
+      <w:tcPr>
+        <w:shd w:val="clear" w:color="auto" w:fill="C1E4F5" w:themeFill="accent1" w:themeFillTint="33"/>
+      </w:tcPr>
+    </w:tblStylePr>
+    <w:tblStylePr w:type="band1Horz">
+      <w:tblPr/>
+      <w:tcPr>
+        <w:shd w:val="clear" w:color="auto" w:fill="C1E4F5" w:themeFill="accent1" w:themeFillTint="33"/>
+      </w:tcPr>
+    </w:tblStylePr>
+  </w:style>
 </w:styles>
 </file>
 

</xml_diff>